<commit_message>
Docs: Documentação Semaforo Inteligente
Documentação PedroPestana
</commit_message>
<xml_diff>
--- a/Docs/Documentaçao-PedroPestana.docx
+++ b/Docs/Documentaçao-PedroPestana.docx
@@ -1175,6 +1175,13 @@
     <w:p/>
     <w:sdt>
       <w:sdtPr>
+        <w:rPr>
+          <w:rFonts w:ascii="Arial" w:eastAsiaTheme="minorHAnsi" w:hAnsi="Arial" w:cstheme="minorBidi"/>
+          <w:color w:val="auto"/>
+          <w:sz w:val="24"/>
+          <w:szCs w:val="22"/>
+          <w:lang w:eastAsia="en-US"/>
+        </w:rPr>
         <w:id w:val="1110936787"/>
         <w:docPartObj>
           <w:docPartGallery w:val="Table of Contents"/>
@@ -1183,13 +1190,8 @@
       </w:sdtPr>
       <w:sdtEndPr>
         <w:rPr>
-          <w:rFonts w:ascii="Arial" w:eastAsiaTheme="minorHAnsi" w:hAnsi="Arial" w:cstheme="minorBidi"/>
           <w:b/>
           <w:bCs/>
-          <w:color w:val="auto"/>
-          <w:sz w:val="24"/>
-          <w:szCs w:val="22"/>
-          <w:lang w:eastAsia="en-US"/>
         </w:rPr>
       </w:sdtEndPr>
       <w:sdtContent>
@@ -4266,7 +4268,11 @@
         <w:t xml:space="preserve">veículos, já a via 1 </w:t>
       </w:r>
       <w:r>
-        <w:t xml:space="preserve">terá um tempo de passagem padrão, quando uma via estiver </w:t>
+        <w:t xml:space="preserve">terá um tempo de </w:t>
+      </w:r>
+      <w:r>
+        <w:lastRenderedPageBreak/>
+        <w:t xml:space="preserve">passagem padrão, quando uma via estiver </w:t>
       </w:r>
       <w:r>
         <w:t xml:space="preserve">no verde ou amarelo a outra obrigatoriamente deve estar no vermelho e ao fim de </w:t>
@@ -5081,6 +5087,7 @@
               <w:jc w:val="both"/>
             </w:pPr>
             <w:r>
+              <w:lastRenderedPageBreak/>
               <w:t>RF05</w:t>
             </w:r>
           </w:p>
@@ -5815,6 +5822,7 @@
               <w:jc w:val="both"/>
             </w:pPr>
             <w:r>
+              <w:lastRenderedPageBreak/>
               <w:t>Resistores</w:t>
             </w:r>
           </w:p>
@@ -6415,6 +6423,7 @@
           <w:sz w:val="32"/>
           <w:szCs w:val="32"/>
         </w:rPr>
+        <w:lastRenderedPageBreak/>
         <w:t>2</w:t>
       </w:r>
       <w:r>
@@ -6722,6 +6731,7 @@
               <w:jc w:val="both"/>
             </w:pPr>
             <w:r>
+              <w:lastRenderedPageBreak/>
               <w:t>Aluno responsável pelo projeto</w:t>
             </w:r>
           </w:p>
@@ -7124,6 +7134,7 @@
         <w:rPr>
           <w:rFonts w:ascii="Arial" w:hAnsi="Arial" w:cs="Arial"/>
         </w:rPr>
+        <w:lastRenderedPageBreak/>
         <w:t>2.</w:t>
       </w:r>
       <w:r>
@@ -8247,7 +8258,6 @@
           <w:sz w:val="32"/>
           <w:szCs w:val="32"/>
         </w:rPr>
-        <w:lastRenderedPageBreak/>
         <w:t>2</w:t>
       </w:r>
       <w:r>
@@ -8485,6 +8495,7 @@
         <w:jc w:val="both"/>
       </w:pPr>
       <w:r>
+        <w:lastRenderedPageBreak/>
         <w:t>Executar somente programas de fontes confiáveis;</w:t>
       </w:r>
     </w:p>
@@ -8895,6 +8906,7 @@
         <w:rPr>
           <w:rFonts w:ascii="Arial" w:hAnsi="Arial" w:cs="Arial"/>
         </w:rPr>
+        <w:lastRenderedPageBreak/>
         <w:t>2</w:t>
       </w:r>
       <w:r>
@@ -9118,6 +9130,7 @@
         <w:rPr>
           <w:rFonts w:ascii="Arial" w:hAnsi="Arial" w:cs="Arial"/>
         </w:rPr>
+        <w:lastRenderedPageBreak/>
         <w:t xml:space="preserve">3.3 </w:t>
       </w:r>
       <w:r>
@@ -9133,6 +9146,9 @@
         <w:jc w:val="both"/>
       </w:pPr>
       <w:r>
+        <w:rPr>
+          <w:noProof/>
+        </w:rPr>
         <w:drawing>
           <wp:inline distT="0" distB="0" distL="0" distR="0" wp14:anchorId="2BCDA826" wp14:editId="0BB87D2B">
             <wp:extent cx="5048955" cy="6677957"/>
@@ -9249,6 +9265,7 @@
         <w:jc w:val="both"/>
       </w:pPr>
       <w:r>
+        <w:lastRenderedPageBreak/>
         <w:t>Após o tempo programado, o sinal da via principal muda para amarelo por 3 segundos, alertando sobre a mudança.</w:t>
       </w:r>
     </w:p>
@@ -10405,6 +10422,9 @@
         <w:jc w:val="both"/>
       </w:pPr>
       <w:r>
+        <w:rPr>
+          <w:noProof/>
+        </w:rPr>
         <w:drawing>
           <wp:inline distT="0" distB="0" distL="0" distR="0" wp14:anchorId="687B7526" wp14:editId="373B96F9">
             <wp:extent cx="5760085" cy="3486150"/>
@@ -10513,6 +10533,48 @@
       </w:r>
       <w:bookmarkEnd w:id="36"/>
     </w:p>
+    <w:p/>
+    <w:p>
+      <w:r>
+        <w:lastRenderedPageBreak/>
+        <w:drawing>
+          <wp:inline distT="0" distB="0" distL="0" distR="0" wp14:anchorId="6F78D24F" wp14:editId="09290BA0">
+            <wp:extent cx="3057952" cy="4458322"/>
+            <wp:effectExtent l="0" t="0" r="9525" b="0"/>
+            <wp:docPr id="766907400" name="Imagem 1"/>
+            <wp:cNvGraphicFramePr>
+              <a:graphicFrameLocks xmlns:a="http://schemas.openxmlformats.org/drawingml/2006/main" noChangeAspect="1"/>
+            </wp:cNvGraphicFramePr>
+            <a:graphic xmlns:a="http://schemas.openxmlformats.org/drawingml/2006/main">
+              <a:graphicData uri="http://schemas.openxmlformats.org/drawingml/2006/picture">
+                <pic:pic xmlns:pic="http://schemas.openxmlformats.org/drawingml/2006/picture">
+                  <pic:nvPicPr>
+                    <pic:cNvPr id="766907400" name=""/>
+                    <pic:cNvPicPr/>
+                  </pic:nvPicPr>
+                  <pic:blipFill>
+                    <a:blip r:embed="rId10"/>
+                    <a:stretch>
+                      <a:fillRect/>
+                    </a:stretch>
+                  </pic:blipFill>
+                  <pic:spPr>
+                    <a:xfrm>
+                      <a:off x="0" y="0"/>
+                      <a:ext cx="3057952" cy="4458322"/>
+                    </a:xfrm>
+                    <a:prstGeom prst="rect">
+                      <a:avLst/>
+                    </a:prstGeom>
+                  </pic:spPr>
+                </pic:pic>
+              </a:graphicData>
+            </a:graphic>
+          </wp:inline>
+        </w:drawing>
+      </w:r>
+    </w:p>
+    <w:p/>
     <w:p>
       <w:pPr>
         <w:pStyle w:val="Recuodecorpodetexto"/>
@@ -10567,6 +10629,9 @@
     </w:p>
     <w:p>
       <w:r>
+        <w:rPr>
+          <w:noProof/>
+        </w:rPr>
         <w:drawing>
           <wp:inline distT="0" distB="0" distL="0" distR="0" wp14:anchorId="1FFF9D35" wp14:editId="2C3EB8E5">
             <wp:extent cx="5391902" cy="1390844"/>
@@ -10583,7 +10648,7 @@
                     <pic:cNvPicPr/>
                   </pic:nvPicPr>
                   <pic:blipFill>
-                    <a:blip r:embed="rId10"/>
+                    <a:blip r:embed="rId11"/>
                     <a:stretch>
                       <a:fillRect/>
                     </a:stretch>
@@ -12696,6 +12761,7 @@
   <w:style w:type="character" w:default="1" w:styleId="Fontepargpadro">
     <w:name w:val="Default Paragraph Font"/>
     <w:uiPriority w:val="1"/>
+    <w:semiHidden/>
     <w:unhideWhenUsed/>
   </w:style>
   <w:style w:type="table" w:default="1" w:styleId="Tabelanormal">

</xml_diff>